<commit_message>
Inicio de sesión en pantalla dividida y colores más oscuros
Co-Authored-By: Claude Opus 5.5 <noreply@anthropic.com>
Claude-Session: https://claude.ai/code/session_01C2tUsjjsV22mWzVYKpWCiU
</commit_message>
<xml_diff>
--- a/docs/Manual_de_Usuario.docx
+++ b/docs/Manual_de_Usuario.docx
@@ -1469,39 +1469,87 @@
                 <w:sz w:val="20"/>
                 <w:szCs w:val="20"/>
               </w:rPr>
-              <w:t xml:space="preserve">La pantalla de inicio de sesión tiene forma de </w:t>
-            </w:r>
-            <w:r>
-              <w:rPr>
-                <w:b/>
-                <w:bCs/>
-                <w:sz w:val="20"/>
-                <w:szCs w:val="20"/>
-              </w:rPr>
-              <w:t xml:space="preserve">cuaderno abierto</w:t>
-            </w:r>
-            <w:r>
-              <w:rPr>
-                <w:sz w:val="20"/>
-                <w:szCs w:val="20"/>
-              </w:rPr>
-              <w:t xml:space="preserve">: en la hoja izquierda aparece la información del salón y en la hoja derecha el formulario. Las </w:t>
-            </w:r>
-            <w:r>
-              <w:rPr>
-                <w:b/>
-                <w:bCs/>
-                <w:sz w:val="20"/>
-                <w:szCs w:val="20"/>
-              </w:rPr>
-              <w:t xml:space="preserve">pestañas de colores</w:t>
-            </w:r>
-            <w:r>
-              <w:rPr>
-                <w:sz w:val="20"/>
-                <w:szCs w:val="20"/>
-              </w:rPr>
-              <w:t xml:space="preserve"> de la parte superior permiten cambiar de perfil (Clienta, Estilista o Administradora).</w:t>
+              <w:t xml:space="preserve">La pantalla de inicio de sesión está dividida en dos: a la </w:t>
+            </w:r>
+            <w:r>
+              <w:rPr>
+                <w:b/>
+                <w:bCs/>
+                <w:sz w:val="20"/>
+                <w:szCs w:val="20"/>
+              </w:rPr>
+              <w:t xml:space="preserve">izquierda</w:t>
+            </w:r>
+            <w:r>
+              <w:rPr>
+                <w:sz w:val="20"/>
+                <w:szCs w:val="20"/>
+              </w:rPr>
+              <w:t xml:space="preserve"> aparece la presentación del salón (servicios y beneficios) y a la </w:t>
+            </w:r>
+            <w:r>
+              <w:rPr>
+                <w:b/>
+                <w:bCs/>
+                <w:sz w:val="20"/>
+                <w:szCs w:val="20"/>
+              </w:rPr>
+              <w:t xml:space="preserve">derecha</w:t>
+            </w:r>
+            <w:r>
+              <w:rPr>
+                <w:sz w:val="20"/>
+                <w:szCs w:val="20"/>
+              </w:rPr>
+              <w:t xml:space="preserve"> el formulario para entrar y una tarjeta con los precios. Los botones </w:t>
+            </w:r>
+            <w:r>
+              <w:rPr>
+                <w:b/>
+                <w:bCs/>
+                <w:sz w:val="20"/>
+                <w:szCs w:val="20"/>
+              </w:rPr>
+              <w:t xml:space="preserve">Clienta</w:t>
+            </w:r>
+            <w:r>
+              <w:rPr>
+                <w:sz w:val="20"/>
+                <w:szCs w:val="20"/>
+              </w:rPr>
+              <w:t xml:space="preserve">, </w:t>
+            </w:r>
+            <w:r>
+              <w:rPr>
+                <w:b/>
+                <w:bCs/>
+                <w:sz w:val="20"/>
+                <w:szCs w:val="20"/>
+              </w:rPr>
+              <w:t xml:space="preserve">Estilista</w:t>
+            </w:r>
+            <w:r>
+              <w:rPr>
+                <w:sz w:val="20"/>
+                <w:szCs w:val="20"/>
+              </w:rPr>
+              <w:t xml:space="preserve"> y </w:t>
+            </w:r>
+            <w:r>
+              <w:rPr>
+                <w:b/>
+                <w:bCs/>
+                <w:sz w:val="20"/>
+                <w:szCs w:val="20"/>
+              </w:rPr>
+              <w:t xml:space="preserve">Administradora</w:t>
+            </w:r>
+            <w:r>
+              <w:rPr>
+                <w:sz w:val="20"/>
+                <w:szCs w:val="20"/>
+              </w:rPr>
+              <w:t xml:space="preserve"> permiten cambiar de perfil.</w:t>
             </w:r>
           </w:p>
           <w:p>

</xml_diff>

<commit_message>
Un solo botón de Ingresar en la página de inicio
Co-Authored-By: Claude Opus 5.5 <noreply@anthropic.com>
Claude-Session: https://claude.ai/code/session_01C2tUsjjsV22mWzVYKpWCiU
</commit_message>
<xml_diff>
--- a/docs/Manual_de_Usuario.docx
+++ b/docs/Manual_de_Usuario.docx
@@ -1323,7 +1323,7 @@
                 <w:sz w:val="20"/>
                 <w:szCs w:val="20"/>
               </w:rPr>
-              <w:t xml:space="preserve">Registrarme</w:t>
+              <w:t xml:space="preserve">Crear cuenta</w:t>
             </w:r>
             <w:r>
               <w:rPr>
@@ -1363,39 +1363,23 @@
                 <w:sz w:val="20"/>
                 <w:szCs w:val="20"/>
               </w:rPr>
-              <w:t xml:space="preserve">Aparece la página de inicio. En la sección </w:t>
-            </w:r>
-            <w:r>
-              <w:rPr>
-                <w:b/>
-                <w:bCs/>
-                <w:sz w:val="20"/>
-                <w:szCs w:val="20"/>
-              </w:rPr>
-              <w:t xml:space="preserve">¿Cómo quieres entrar?</w:t>
-            </w:r>
-            <w:r>
-              <w:rPr>
-                <w:sz w:val="20"/>
-                <w:szCs w:val="20"/>
-              </w:rPr>
-              <w:t xml:space="preserve"> elegir el perfil y pulsar </w:t>
-            </w:r>
-            <w:r>
-              <w:rPr>
-                <w:b/>
-                <w:bCs/>
-                <w:sz w:val="20"/>
-                <w:szCs w:val="20"/>
-              </w:rPr>
-              <w:t xml:space="preserve">Iniciar sesión</w:t>
-            </w:r>
-            <w:r>
-              <w:rPr>
-                <w:sz w:val="20"/>
-                <w:szCs w:val="20"/>
-              </w:rPr>
-              <w:t xml:space="preserve">:</w:t>
+              <w:t xml:space="preserve">Aparece la página de inicio. Pulsar el botón </w:t>
+            </w:r>
+            <w:r>
+              <w:rPr>
+                <w:b/>
+                <w:bCs/>
+                <w:sz w:val="20"/>
+                <w:szCs w:val="20"/>
+              </w:rPr>
+              <w:t xml:space="preserve">Ingresar</w:t>
+            </w:r>
+            <w:r>
+              <w:rPr>
+                <w:sz w:val="20"/>
+                <w:szCs w:val="20"/>
+              </w:rPr>
+              <w:t xml:space="preserve">, arriba a la derecha. Es la única entrada al sistema para los tres perfiles:</w:t>
             </w:r>
           </w:p>
           <w:p>
@@ -1408,7 +1392,7 @@
                 <wp:inline distT="0" distB="0" distL="0" distR="0">
                   <wp:extent cx="3838575" cy="2400300"/>
                   <wp:effectExtent t="0" r="0" b="0" l="0"/>
-                  <wp:docPr id="1" name="Figura 1. Página de inicio: elección del perfil" descr="Figura 1. Página de inicio: elección del perfil" title="Figura 1. Página de inicio: elección del perfil"/>
+                  <wp:docPr id="1" name="Figura 1. Página de inicio con el botón Ingresar" descr="Figura 1. Página de inicio con el botón Ingresar" title="Figura 1. Página de inicio con el botón Ingresar"/>
                   <wp:cNvGraphicFramePr>
                     <a:graphicFrameLocks xmlns:a="http://schemas.openxmlformats.org/drawingml/2006/main" noChangeAspect="1"/>
                   </wp:cNvGraphicFramePr>
@@ -1457,7 +1441,7 @@
                 <w:sz w:val="18"/>
                 <w:szCs w:val="18"/>
               </w:rPr>
-              <w:t xml:space="preserve">Figura 1. Página de inicio: elección del perfil</w:t>
+              <w:t xml:space="preserve">Figura 1. Página de inicio con el botón Ingresar</w:t>
             </w:r>
           </w:p>
           <w:p>
@@ -1561,16 +1545,16 @@
                 <w:sz w:val="20"/>
                 <w:szCs w:val="20"/>
               </w:rPr>
-              <w:t xml:space="preserve">Escribir el usuario y la contraseña y oprimir el botón </w:t>
-            </w:r>
-            <w:r>
-              <w:rPr>
-                <w:b/>
-                <w:bCs/>
-                <w:sz w:val="20"/>
-                <w:szCs w:val="20"/>
-              </w:rPr>
-              <w:t xml:space="preserve">Iniciar sesión</w:t>
+              <w:t xml:space="preserve">Elegir el perfil, escribir el usuario y la contraseña y oprimir </w:t>
+            </w:r>
+            <w:r>
+              <w:rPr>
+                <w:b/>
+                <w:bCs/>
+                <w:sz w:val="20"/>
+                <w:szCs w:val="20"/>
+              </w:rPr>
+              <w:t xml:space="preserve">Entrar</w:t>
             </w:r>
             <w:r>
               <w:rPr>
@@ -1772,7 +1756,7 @@
                 <w:sz w:val="20"/>
                 <w:szCs w:val="20"/>
               </w:rPr>
-              <w:t xml:space="preserve">Iniciar sesión</w:t>
+              <w:t xml:space="preserve">Ingresar</w:t>
             </w:r>
             <w:r>
               <w:rPr>
@@ -1788,7 +1772,7 @@
                 <w:sz w:val="20"/>
                 <w:szCs w:val="20"/>
               </w:rPr>
-              <w:t xml:space="preserve">Registrarme</w:t>
+              <w:t xml:space="preserve">Crear cuenta</w:t>
             </w:r>
             <w:r>
               <w:rPr>
@@ -2008,7 +1992,7 @@
                       <w:sz w:val="19"/>
                       <w:szCs w:val="19"/>
                     </w:rPr>
-                    <w:t xml:space="preserve">Iniciar sesión</w:t>
+                    <w:t xml:space="preserve">Ingresar / Entrar</w:t>
                   </w:r>
                 </w:p>
               </w:tc>
@@ -2034,7 +2018,7 @@
                       <w:sz w:val="19"/>
                       <w:szCs w:val="19"/>
                     </w:rPr>
-                    <w:t xml:space="preserve">Entra al panel con usuario y contraseña.</w:t>
+                    <w:t xml:space="preserve">Abre el inicio de sesión y entra al panel con usuario y contraseña.</w:t>
                   </w:r>
                 </w:p>
               </w:tc>
@@ -2062,7 +2046,7 @@
                       <w:sz w:val="19"/>
                       <w:szCs w:val="19"/>
                     </w:rPr>
-                    <w:t xml:space="preserve">Registrarme</w:t>
+                    <w:t xml:space="preserve">Crear cuenta</w:t>
                   </w:r>
                 </w:p>
               </w:tc>
@@ -2088,7 +2072,7 @@
                       <w:sz w:val="19"/>
                       <w:szCs w:val="19"/>
                     </w:rPr>
-                    <w:t xml:space="preserve">Abre el formulario para crear una cuenta.</w:t>
+                    <w:t xml:space="preserve">Abre el formulario para registrarse.</w:t>
                   </w:r>
                 </w:p>
               </w:tc>
@@ -2790,14 +2774,30 @@
                 <w:sz w:val="20"/>
                 <w:szCs w:val="20"/>
               </w:rPr>
-              <w:t xml:space="preserve">Registrarme</w:t>
-            </w:r>
-            <w:r>
-              <w:rPr>
-                <w:sz w:val="20"/>
-                <w:szCs w:val="20"/>
-              </w:rPr>
-              <w:t xml:space="preserve"> en la tarjeta del perfil deseado.</w:t>
+              <w:t xml:space="preserve">Crear cuenta</w:t>
+            </w:r>
+            <w:r>
+              <w:rPr>
+                <w:sz w:val="20"/>
+                <w:szCs w:val="20"/>
+              </w:rPr>
+              <w:t xml:space="preserve"> en la página de inicio, o </w:t>
+            </w:r>
+            <w:r>
+              <w:rPr>
+                <w:b/>
+                <w:bCs/>
+                <w:sz w:val="20"/>
+                <w:szCs w:val="20"/>
+              </w:rPr>
+              <w:t xml:space="preserve">¿No tienes cuenta? Regístrate</w:t>
+            </w:r>
+            <w:r>
+              <w:rPr>
+                <w:sz w:val="20"/>
+                <w:szCs w:val="20"/>
+              </w:rPr>
+              <w:t xml:space="preserve"> en el inicio de sesión. Arriba del formulario, elegir el tipo de cuenta.</w:t>
             </w:r>
           </w:p>
           <w:p>

</xml_diff>

<commit_message>
Botón Volver al inicio en la página de presentación
Co-Authored-By: Claude Opus 5.5 <noreply@anthropic.com>
Claude-Session: https://claude.ai/code/session_01C2tUsjjsV22mWzVYKpWCiU
</commit_message>
<xml_diff>
--- a/docs/Manual_de_Usuario.docx
+++ b/docs/Manual_de_Usuario.docx
@@ -1605,23 +1605,23 @@
                 <w:sz w:val="20"/>
                 <w:szCs w:val="20"/>
               </w:rPr>
-              <w:t xml:space="preserve"> abre la página de presentación del salón, que tiene un botón </w:t>
-            </w:r>
-            <w:r>
-              <w:rPr>
-                <w:b/>
-                <w:bCs/>
-                <w:sz w:val="20"/>
-                <w:szCs w:val="20"/>
-              </w:rPr>
-              <w:t xml:space="preserve">Ingresar</w:t>
-            </w:r>
-            <w:r>
-              <w:rPr>
-                <w:sz w:val="20"/>
-                <w:szCs w:val="20"/>
-              </w:rPr>
-              <w:t xml:space="preserve"> para volver.</w:t>
+              <w:t xml:space="preserve"> abre la página de presentación del salón, que tiene arriba el botón </w:t>
+            </w:r>
+            <w:r>
+              <w:rPr>
+                <w:b/>
+                <w:bCs/>
+                <w:sz w:val="20"/>
+                <w:szCs w:val="20"/>
+              </w:rPr>
+              <w:t xml:space="preserve">← Volver al inicio</w:t>
+            </w:r>
+            <w:r>
+              <w:rPr>
+                <w:sz w:val="20"/>
+                <w:szCs w:val="20"/>
+              </w:rPr>
+              <w:t xml:space="preserve"> para regresar al inicio de sesión sin usar el botón Atrás del navegador.</w:t>
             </w:r>
           </w:p>
           <w:p>
@@ -2008,7 +2008,7 @@
                       <w:sz w:val="19"/>
                       <w:szCs w:val="19"/>
                     </w:rPr>
-                    <w:t xml:space="preserve">Ingresar / Entrar</w:t>
+                    <w:t xml:space="preserve">Entrar</w:t>
                   </w:r>
                 </w:p>
               </w:tc>
@@ -2034,7 +2034,61 @@
                       <w:sz w:val="19"/>
                       <w:szCs w:val="19"/>
                     </w:rPr>
-                    <w:t xml:space="preserve">Abre el inicio de sesión y entra al panel con usuario y contraseña.</w:t>
+                    <w:t xml:space="preserve">Entra al panel con usuario y contraseña.</w:t>
+                  </w:r>
+                </w:p>
+              </w:tc>
+            </w:tr>
+            <w:tr>
+              <w:tc>
+                <w:tcPr>
+                  <w:tcW w:type="dxa" w:w="2100"/>
+                  <w:tcBorders>
+                    <w:top w:val="single" w:color="D9C2CE" w:sz="4"/>
+                    <w:left w:val="single" w:color="D9C2CE" w:sz="4"/>
+                    <w:bottom w:val="single" w:color="D9C2CE" w:sz="4"/>
+                    <w:right w:val="single" w:color="D9C2CE" w:sz="4"/>
+                  </w:tcBorders>
+                  <w:tcMar>
+                    <w:top w:type="dxa" w:w="60"/>
+                    <w:left w:type="dxa" w:w="100"/>
+                    <w:bottom w:type="dxa" w:w="60"/>
+                    <w:right w:type="dxa" w:w="100"/>
+                  </w:tcMar>
+                </w:tcPr>
+                <w:p>
+                  <w:r>
+                    <w:rPr>
+                      <w:sz w:val="19"/>
+                      <w:szCs w:val="19"/>
+                    </w:rPr>
+                    <w:t xml:space="preserve">← Volver al inicio</w:t>
+                  </w:r>
+                </w:p>
+              </w:tc>
+              <w:tc>
+                <w:tcPr>
+                  <w:tcW w:type="dxa" w:w="4200"/>
+                  <w:tcBorders>
+                    <w:top w:val="single" w:color="D9C2CE" w:sz="4"/>
+                    <w:left w:val="single" w:color="D9C2CE" w:sz="4"/>
+                    <w:bottom w:val="single" w:color="D9C2CE" w:sz="4"/>
+                    <w:right w:val="single" w:color="D9C2CE" w:sz="4"/>
+                  </w:tcBorders>
+                  <w:tcMar>
+                    <w:top w:type="dxa" w:w="60"/>
+                    <w:left w:type="dxa" w:w="100"/>
+                    <w:bottom w:type="dxa" w:w="60"/>
+                    <w:right w:type="dxa" w:w="100"/>
+                  </w:tcMar>
+                </w:tcPr>
+                <w:p>
+                  <w:r>
+                    <w:rPr>
+                      <w:sz w:val="19"/>
+                      <w:szCs w:val="19"/>
+                    </w:rPr>
+                    <w:t xml:space="preserve">Desde la presentación del salón, regresa al inicio de sesión.</w:t>
                   </w:r>
                 </w:p>
               </w:tc>

</xml_diff>